<commit_message>
docs: update authors to Shreyas P, Ch. Karthikeya, Abhinav S, Vasudeva, and T. Harsha Vardhan
</commit_message>
<xml_diff>
--- a/conference_paper_ieee.docx
+++ b/conference_paper_ieee.docx
@@ -30,33 +30,46 @@
       <w:tr>
         <w:tc>
           <w:tcPr>
-            <w:tcW w:type="dxa" w:w="3456"/>
+            <w:tcW w:type="dxa" w:w="3470"/>
+            <w:tcBorders>
+              <w:top w:val="none" w:sz="6" w:space="0" w:color="000000"/>
+              <w:left w:val="none" w:sz="4" w:space="0" w:color="000000"/>
+              <w:bottom w:val="none" w:sz="6" w:space="0" w:color="000000"/>
+              <w:right w:val="none" w:sz="4" w:space="0" w:color="000000"/>
+            </w:tcBorders>
           </w:tcPr>
           <w:p>
             <w:pPr>
-              <w:spacing w:before="0" w:after="40" w:line="240" w:lineRule="auto"/>
+              <w:spacing w:before="80" w:after="40" w:line="240" w:lineRule="auto"/>
               <w:jc w:val="center"/>
             </w:pPr>
             <w:r>
               <w:rPr>
                 <w:rFonts w:ascii="Times New Roman" w:hAnsi="Times New Roman"/>
-                <w:b/>
-                <w:sz w:val="22"/>
+                <w:sz w:val="21"/>
               </w:rPr>
-              <w:t>Author 1</w:t>
+              <w:t>1st Shreyas P</w:t>
               <w:br/>
             </w:r>
             <w:r>
               <w:rPr>
                 <w:rFonts w:ascii="Times New Roman" w:hAnsi="Times New Roman"/>
                 <w:i/>
-                <w:sz w:val="20"/>
+                <w:sz w:val="19"/>
               </w:rPr>
-              <w:t>dept. name of organization</w:t>
+              <w:t>Department of Artificial Intelligence</w:t>
               <w:br/>
-              <w:t>name of organization</w:t>
+              <w:t>and Data Science</w:t>
               <w:br/>
-              <w:t>City, Country</w:t>
+              <w:t>KLH</w:t>
+              <w:br/>
+            </w:r>
+            <w:r>
+              <w:rPr>
+                <w:rFonts w:ascii="Times New Roman" w:hAnsi="Times New Roman"/>
+                <w:sz w:val="19"/>
+              </w:rPr>
+              <w:t>Hyderabad, India</w:t>
               <w:br/>
             </w:r>
             <w:r>
@@ -64,39 +77,52 @@
                 <w:rFonts w:ascii="Times New Roman" w:hAnsi="Times New Roman"/>
                 <w:sz w:val="18"/>
               </w:rPr>
-              <w:t>author1@institution.edu</w:t>
+              <w:t>[email address or ORCID]</w:t>
             </w:r>
           </w:p>
         </w:tc>
         <w:tc>
           <w:tcPr>
-            <w:tcW w:type="dxa" w:w="3456"/>
+            <w:tcW w:type="dxa" w:w="3470"/>
+            <w:tcBorders>
+              <w:top w:val="none" w:sz="6" w:space="0" w:color="000000"/>
+              <w:left w:val="none" w:sz="4" w:space="0" w:color="000000"/>
+              <w:bottom w:val="none" w:sz="6" w:space="0" w:color="000000"/>
+              <w:right w:val="none" w:sz="4" w:space="0" w:color="000000"/>
+            </w:tcBorders>
           </w:tcPr>
           <w:p>
             <w:pPr>
-              <w:spacing w:before="0" w:after="40" w:line="240" w:lineRule="auto"/>
+              <w:spacing w:before="80" w:after="40" w:line="240" w:lineRule="auto"/>
               <w:jc w:val="center"/>
             </w:pPr>
             <w:r>
               <w:rPr>
                 <w:rFonts w:ascii="Times New Roman" w:hAnsi="Times New Roman"/>
-                <w:b/>
-                <w:sz w:val="22"/>
+                <w:sz w:val="21"/>
               </w:rPr>
-              <w:t>Author 2</w:t>
+              <w:t>2nd Ch. Karthikeya</w:t>
               <w:br/>
             </w:r>
             <w:r>
               <w:rPr>
                 <w:rFonts w:ascii="Times New Roman" w:hAnsi="Times New Roman"/>
                 <w:i/>
-                <w:sz w:val="20"/>
+                <w:sz w:val="19"/>
               </w:rPr>
-              <w:t>dept. name of organization</w:t>
+              <w:t>Department of Artificial Intelligence</w:t>
               <w:br/>
-              <w:t>name of organization</w:t>
+              <w:t>and Data Science</w:t>
               <w:br/>
-              <w:t>City, Country</w:t>
+              <w:t>KLH</w:t>
+              <w:br/>
+            </w:r>
+            <w:r>
+              <w:rPr>
+                <w:rFonts w:ascii="Times New Roman" w:hAnsi="Times New Roman"/>
+                <w:sz w:val="19"/>
+              </w:rPr>
+              <w:t>Hyderabad, India</w:t>
               <w:br/>
             </w:r>
             <w:r>
@@ -104,39 +130,52 @@
                 <w:rFonts w:ascii="Times New Roman" w:hAnsi="Times New Roman"/>
                 <w:sz w:val="18"/>
               </w:rPr>
-              <w:t>author2@institution.edu</w:t>
+              <w:t>[email address or ORCID]</w:t>
             </w:r>
           </w:p>
         </w:tc>
         <w:tc>
           <w:tcPr>
-            <w:tcW w:type="dxa" w:w="3456"/>
+            <w:tcW w:type="dxa" w:w="3470"/>
+            <w:tcBorders>
+              <w:top w:val="none" w:sz="6" w:space="0" w:color="000000"/>
+              <w:left w:val="none" w:sz="4" w:space="0" w:color="000000"/>
+              <w:bottom w:val="none" w:sz="6" w:space="0" w:color="000000"/>
+              <w:right w:val="none" w:sz="4" w:space="0" w:color="000000"/>
+            </w:tcBorders>
           </w:tcPr>
           <w:p>
             <w:pPr>
-              <w:spacing w:before="0" w:after="40" w:line="240" w:lineRule="auto"/>
+              <w:spacing w:before="80" w:after="40" w:line="240" w:lineRule="auto"/>
               <w:jc w:val="center"/>
             </w:pPr>
             <w:r>
               <w:rPr>
                 <w:rFonts w:ascii="Times New Roman" w:hAnsi="Times New Roman"/>
-                <w:b/>
-                <w:sz w:val="22"/>
+                <w:sz w:val="21"/>
               </w:rPr>
-              <w:t>Author 3</w:t>
+              <w:t>3rd Abhinav S</w:t>
               <w:br/>
             </w:r>
             <w:r>
               <w:rPr>
                 <w:rFonts w:ascii="Times New Roman" w:hAnsi="Times New Roman"/>
                 <w:i/>
-                <w:sz w:val="20"/>
+                <w:sz w:val="19"/>
               </w:rPr>
-              <w:t>dept. name of organization</w:t>
+              <w:t>Department of Artificial Intelligence</w:t>
               <w:br/>
-              <w:t>name of organization</w:t>
+              <w:t>and Data Science</w:t>
               <w:br/>
-              <w:t>City, Country</w:t>
+              <w:t>KLH</w:t>
+              <w:br/>
+            </w:r>
+            <w:r>
+              <w:rPr>
+                <w:rFonts w:ascii="Times New Roman" w:hAnsi="Times New Roman"/>
+                <w:sz w:val="19"/>
+              </w:rPr>
+              <w:t>Hyderabad, India</w:t>
               <w:br/>
             </w:r>
             <w:r>
@@ -144,9 +183,129 @@
                 <w:rFonts w:ascii="Times New Roman" w:hAnsi="Times New Roman"/>
                 <w:sz w:val="18"/>
               </w:rPr>
-              <w:t>author3@institution.edu</w:t>
+              <w:t>[email address or ORCID]</w:t>
             </w:r>
           </w:p>
+        </w:tc>
+      </w:tr>
+      <w:tr>
+        <w:tc>
+          <w:tcPr>
+            <w:tcW w:type="dxa" w:w="3470"/>
+            <w:tcBorders>
+              <w:top w:val="none" w:sz="6" w:space="0" w:color="000000"/>
+              <w:left w:val="none" w:sz="4" w:space="0" w:color="000000"/>
+              <w:bottom w:val="none" w:sz="6" w:space="0" w:color="000000"/>
+              <w:right w:val="none" w:sz="4" w:space="0" w:color="000000"/>
+            </w:tcBorders>
+          </w:tcPr>
+          <w:p>
+            <w:pPr>
+              <w:spacing w:before="80" w:after="40" w:line="240" w:lineRule="auto"/>
+              <w:jc w:val="center"/>
+            </w:pPr>
+            <w:r>
+              <w:rPr>
+                <w:rFonts w:ascii="Times New Roman" w:hAnsi="Times New Roman"/>
+                <w:sz w:val="21"/>
+              </w:rPr>
+              <w:t>4th Vasudeva</w:t>
+              <w:br/>
+            </w:r>
+            <w:r>
+              <w:rPr>
+                <w:rFonts w:ascii="Times New Roman" w:hAnsi="Times New Roman"/>
+                <w:i/>
+                <w:sz w:val="19"/>
+              </w:rPr>
+              <w:t>Department of Artificial Intelligence</w:t>
+              <w:br/>
+              <w:t>and Data Science</w:t>
+              <w:br/>
+              <w:t>KLH</w:t>
+              <w:br/>
+            </w:r>
+            <w:r>
+              <w:rPr>
+                <w:rFonts w:ascii="Times New Roman" w:hAnsi="Times New Roman"/>
+                <w:sz w:val="19"/>
+              </w:rPr>
+              <w:t>Hyderabad, India</w:t>
+              <w:br/>
+            </w:r>
+            <w:r>
+              <w:rPr>
+                <w:rFonts w:ascii="Times New Roman" w:hAnsi="Times New Roman"/>
+                <w:sz w:val="18"/>
+              </w:rPr>
+              <w:t>[email address or ORCID]</w:t>
+            </w:r>
+          </w:p>
+        </w:tc>
+        <w:tc>
+          <w:tcPr>
+            <w:tcW w:type="dxa" w:w="3470"/>
+            <w:tcBorders>
+              <w:top w:val="none" w:sz="6" w:space="0" w:color="000000"/>
+              <w:left w:val="none" w:sz="4" w:space="0" w:color="000000"/>
+              <w:bottom w:val="none" w:sz="6" w:space="0" w:color="000000"/>
+              <w:right w:val="none" w:sz="4" w:space="0" w:color="000000"/>
+            </w:tcBorders>
+          </w:tcPr>
+          <w:p>
+            <w:pPr>
+              <w:spacing w:before="80" w:after="40" w:line="240" w:lineRule="auto"/>
+              <w:jc w:val="center"/>
+            </w:pPr>
+            <w:r>
+              <w:rPr>
+                <w:rFonts w:ascii="Times New Roman" w:hAnsi="Times New Roman"/>
+                <w:sz w:val="21"/>
+              </w:rPr>
+              <w:t>5th T. Harsha Vardhan</w:t>
+              <w:br/>
+            </w:r>
+            <w:r>
+              <w:rPr>
+                <w:rFonts w:ascii="Times New Roman" w:hAnsi="Times New Roman"/>
+                <w:i/>
+                <w:sz w:val="19"/>
+              </w:rPr>
+              <w:t>Department of Artificial Intelligence</w:t>
+              <w:br/>
+              <w:t>and Data Science</w:t>
+              <w:br/>
+              <w:t>KLH</w:t>
+              <w:br/>
+            </w:r>
+            <w:r>
+              <w:rPr>
+                <w:rFonts w:ascii="Times New Roman" w:hAnsi="Times New Roman"/>
+                <w:sz w:val="19"/>
+              </w:rPr>
+              <w:t>Hyderabad, India</w:t>
+              <w:br/>
+            </w:r>
+            <w:r>
+              <w:rPr>
+                <w:rFonts w:ascii="Times New Roman" w:hAnsi="Times New Roman"/>
+                <w:sz w:val="18"/>
+              </w:rPr>
+              <w:t>[email address or ORCID]</w:t>
+            </w:r>
+          </w:p>
+        </w:tc>
+        <w:tc>
+          <w:tcPr>
+            <w:tcW w:type="dxa" w:w="3470"/>
+            <w:tcBorders>
+              <w:top w:val="none" w:sz="6" w:space="0" w:color="000000"/>
+              <w:left w:val="none" w:sz="4" w:space="0" w:color="000000"/>
+              <w:bottom w:val="none" w:sz="6" w:space="0" w:color="000000"/>
+              <w:right w:val="none" w:sz="4" w:space="0" w:color="000000"/>
+            </w:tcBorders>
+          </w:tcPr>
+          <w:p/>
         </w:tc>
       </w:tr>
     </w:tbl>

</xml_diff>